<commit_message>
Docs: organiza documentação externa do tensiômetro
</commit_message>
<xml_diff>
--- a/docs/Relatorio_Desenvolvimento_Software_Tensiometro_Ilustrado.docx
+++ b/docs/Relatorio_Desenvolvimento_Software_Tensiometro_Ilustrado.docx
@@ -134,17 +134,108 @@
     <w:p>
       <w:pPr>
         <w:jc w:val="center"/>
+        <w:rPr>
+          <w:color w:val="607D8B"/>
+        </w:rPr>
+      </w:pPr>
+    </w:p>
+    <w:p>
+      <w:pPr>
+        <w:jc w:val="center"/>
+        <w:rPr>
+          <w:color w:val="607D8B"/>
+        </w:rPr>
+      </w:pPr>
+    </w:p>
+    <w:p>
+      <w:pPr>
+        <w:jc w:val="center"/>
+        <w:rPr>
+          <w:color w:val="607D8B"/>
+        </w:rPr>
+      </w:pPr>
+    </w:p>
+    <w:p>
+      <w:pPr>
+        <w:jc w:val="center"/>
+        <w:rPr>
+          <w:color w:val="607D8B"/>
+        </w:rPr>
+      </w:pPr>
+    </w:p>
+    <w:p>
+      <w:pPr>
+        <w:jc w:val="center"/>
+        <w:rPr>
+          <w:color w:val="607D8B"/>
+        </w:rPr>
+      </w:pPr>
+    </w:p>
+    <w:p>
+      <w:pPr>
+        <w:jc w:val="center"/>
+        <w:rPr>
+          <w:color w:val="607D8B"/>
+        </w:rPr>
+      </w:pPr>
+    </w:p>
+    <w:p>
+      <w:pPr>
+        <w:jc w:val="center"/>
+        <w:rPr>
+          <w:color w:val="607D8B"/>
+        </w:rPr>
+      </w:pPr>
+    </w:p>
+    <w:p>
+      <w:pPr>
+        <w:jc w:val="center"/>
+        <w:rPr>
+          <w:color w:val="607D8B"/>
+        </w:rPr>
+      </w:pPr>
+    </w:p>
+    <w:p>
+      <w:pPr>
+        <w:jc w:val="center"/>
+        <w:rPr>
+          <w:color w:val="607D8B"/>
+        </w:rPr>
+      </w:pPr>
+    </w:p>
+    <w:p>
+      <w:pPr>
+        <w:jc w:val="center"/>
+        <w:rPr>
+          <w:color w:val="607D8B"/>
+        </w:rPr>
+      </w:pPr>
+    </w:p>
+    <w:p>
+      <w:pPr>
+        <w:jc w:val="center"/>
+        <w:rPr>
+          <w:color w:val="607D8B"/>
+        </w:rPr>
+      </w:pPr>
+    </w:p>
+    <w:p>
+      <w:pPr>
+        <w:jc w:val="center"/>
+        <w:rPr>
+          <w:color w:val="607D8B"/>
+        </w:rPr>
+      </w:pPr>
+    </w:p>
+    <w:p>
+      <w:pPr>
+        <w:jc w:val="center"/>
       </w:pPr>
       <w:r>
         <w:rPr>
           <w:color w:val="607D8B"/>
         </w:rPr>
         <w:t>Manaus/AM  •  30 de julho de 2026</w:t>
-      </w:r>
-    </w:p>
-    <w:p>
-      <w:r>
-        <w:br w:type="page"/>
       </w:r>
     </w:p>
     <w:p>

</xml_diff>